<commit_message>
BB Call New Verstion
V1
</commit_message>
<xml_diff>
--- a/BB Call Call back/Project-BB Call Call back.docx
+++ b/BB Call Call back/Project-BB Call Call back.docx
@@ -51,7 +51,7 @@
     </w:p>
     <w:p>
       <w:pPr>
-        <w:pStyle w:val="TOC1"/>
+        <w:pStyle w:val="11"/>
         <w:tabs>
           <w:tab w:val="right" w:leader="dot" w:pos="9350"/>
         </w:tabs>
@@ -62,7 +62,7 @@
       <w:hyperlink w:anchor="_Toc225796520" w:history="1">
         <w:r>
           <w:rPr>
-            <w:rStyle w:val="Hyperlink"/>
+            <w:rStyle w:val="af2"/>
             <w:noProof/>
           </w:rPr>
           <w:t>I. Summary</w:t>
@@ -119,7 +119,7 @@
     </w:p>
     <w:p>
       <w:pPr>
-        <w:pStyle w:val="TOC2"/>
+        <w:pStyle w:val="21"/>
         <w:tabs>
           <w:tab w:val="right" w:leader="dot" w:pos="9350"/>
         </w:tabs>
@@ -130,7 +130,7 @@
       <w:hyperlink w:anchor="_Toc225796521" w:history="1">
         <w:r>
           <w:rPr>
-            <w:rStyle w:val="Hyperlink"/>
+            <w:rStyle w:val="af2"/>
             <w:noProof/>
           </w:rPr>
           <w:t>(I) Searching</w:t>
@@ -187,7 +187,7 @@
     </w:p>
     <w:p>
       <w:pPr>
-        <w:pStyle w:val="TOC1"/>
+        <w:pStyle w:val="11"/>
         <w:tabs>
           <w:tab w:val="right" w:leader="dot" w:pos="9350"/>
         </w:tabs>
@@ -198,7 +198,7 @@
       <w:hyperlink w:anchor="_Toc225796522" w:history="1">
         <w:r>
           <w:rPr>
-            <w:rStyle w:val="Hyperlink"/>
+            <w:rStyle w:val="af2"/>
             <w:noProof/>
           </w:rPr>
           <w:t>II. Key word</w:t>
@@ -255,7 +255,7 @@
     </w:p>
     <w:p>
       <w:pPr>
-        <w:pStyle w:val="TOC1"/>
+        <w:pStyle w:val="11"/>
         <w:tabs>
           <w:tab w:val="right" w:leader="dot" w:pos="9350"/>
         </w:tabs>
@@ -266,7 +266,7 @@
       <w:hyperlink w:anchor="_Toc225796523" w:history="1">
         <w:r>
           <w:rPr>
-            <w:rStyle w:val="Hyperlink"/>
+            <w:rStyle w:val="af2"/>
             <w:noProof/>
           </w:rPr>
           <w:t>III. Simple Introduce</w:t>
@@ -323,7 +323,7 @@
     </w:p>
     <w:p>
       <w:pPr>
-        <w:pStyle w:val="TOC2"/>
+        <w:pStyle w:val="21"/>
         <w:tabs>
           <w:tab w:val="right" w:leader="dot" w:pos="9350"/>
         </w:tabs>
@@ -334,7 +334,7 @@
       <w:hyperlink w:anchor="_Toc225796524" w:history="1">
         <w:r>
           <w:rPr>
-            <w:rStyle w:val="Hyperlink"/>
+            <w:rStyle w:val="af2"/>
             <w:noProof/>
           </w:rPr>
           <w:t>(II) Device and Material</w:t>
@@ -391,7 +391,7 @@
     </w:p>
     <w:p>
       <w:pPr>
-        <w:pStyle w:val="TOC2"/>
+        <w:pStyle w:val="21"/>
         <w:tabs>
           <w:tab w:val="right" w:leader="dot" w:pos="9350"/>
         </w:tabs>
@@ -402,7 +402,7 @@
       <w:hyperlink w:anchor="_Toc225796525" w:history="1">
         <w:r>
           <w:rPr>
-            <w:rStyle w:val="Hyperlink"/>
+            <w:rStyle w:val="af2"/>
             <w:noProof/>
           </w:rPr>
           <w:t>(III) Software</w:t>
@@ -459,7 +459,7 @@
     </w:p>
     <w:p>
       <w:pPr>
-        <w:pStyle w:val="TOC1"/>
+        <w:pStyle w:val="11"/>
         <w:tabs>
           <w:tab w:val="right" w:leader="dot" w:pos="9350"/>
         </w:tabs>
@@ -470,7 +470,7 @@
       <w:hyperlink w:anchor="_Toc225796526" w:history="1">
         <w:r>
           <w:rPr>
-            <w:rStyle w:val="Hyperlink"/>
+            <w:rStyle w:val="af2"/>
             <w:noProof/>
           </w:rPr>
           <w:t>V. Step of Interface</w:t>
@@ -527,7 +527,7 @@
     </w:p>
     <w:p>
       <w:pPr>
-        <w:pStyle w:val="TOC1"/>
+        <w:pStyle w:val="11"/>
         <w:tabs>
           <w:tab w:val="right" w:leader="dot" w:pos="9350"/>
         </w:tabs>
@@ -538,7 +538,7 @@
       <w:hyperlink w:anchor="_Toc225796527" w:history="1">
         <w:r>
           <w:rPr>
-            <w:rStyle w:val="Hyperlink"/>
+            <w:rStyle w:val="af2"/>
             <w:noProof/>
           </w:rPr>
           <w:t>VI. Discuss</w:t>
@@ -595,7 +595,7 @@
     </w:p>
     <w:p>
       <w:pPr>
-        <w:pStyle w:val="TOC1"/>
+        <w:pStyle w:val="11"/>
         <w:tabs>
           <w:tab w:val="right" w:leader="dot" w:pos="9350"/>
         </w:tabs>
@@ -606,7 +606,7 @@
       <w:hyperlink w:anchor="_Toc225796528" w:history="1">
         <w:r>
           <w:rPr>
-            <w:rStyle w:val="Hyperlink"/>
+            <w:rStyle w:val="af2"/>
             <w:noProof/>
           </w:rPr>
           <w:t>VII. Final discuss and Suggestion</w:t>
@@ -663,7 +663,7 @@
     </w:p>
     <w:p>
       <w:pPr>
-        <w:pStyle w:val="TOC1"/>
+        <w:pStyle w:val="11"/>
         <w:tabs>
           <w:tab w:val="right" w:leader="dot" w:pos="9350"/>
         </w:tabs>
@@ -674,7 +674,7 @@
       <w:hyperlink w:anchor="_Toc225796529" w:history="1">
         <w:r>
           <w:rPr>
-            <w:rStyle w:val="Hyperlink"/>
+            <w:rStyle w:val="af2"/>
             <w:noProof/>
           </w:rPr>
           <w:t>VIII. Recourse</w:t>
@@ -731,7 +731,7 @@
     </w:p>
     <w:p>
       <w:pPr>
-        <w:pStyle w:val="TOC1"/>
+        <w:pStyle w:val="11"/>
         <w:tabs>
           <w:tab w:val="right" w:leader="dot" w:pos="9350"/>
         </w:tabs>
@@ -742,7 +742,7 @@
       <w:hyperlink w:anchor="_Toc225796530" w:history="1">
         <w:r>
           <w:rPr>
-            <w:rStyle w:val="Hyperlink"/>
+            <w:rStyle w:val="af2"/>
             <w:noProof/>
           </w:rPr>
           <w:t>VIIII. Operation Manual</w:t>
@@ -844,11 +844,6 @@
       <w:bookmarkEnd w:id="3"/>
     </w:p>
     <w:p>
-      <w:pPr>
-        <w:rPr>
-          <w:rFonts w:hint="eastAsia"/>
-        </w:rPr>
-      </w:pPr>
       <w:r>
         <w:t xml:space="preserve">According the technology </w:t>
       </w:r>
@@ -923,11 +918,6 @@
       <w:bookmarkEnd w:id="5"/>
     </w:p>
     <w:p>
-      <w:pPr>
-        <w:rPr>
-          <w:rFonts w:hint="eastAsia"/>
-        </w:rPr>
-      </w:pPr>
       <w:r>
         <w:rPr>
           <w:rFonts w:hint="eastAsia"/>
@@ -962,10 +952,15 @@
       </w:r>
     </w:p>
     <w:p>
-      <w:r>
+      <w:pPr>
         <w:rPr>
           <w:rFonts w:hint="eastAsia"/>
         </w:rPr>
+      </w:pPr>
+      <w:r>
+        <w:rPr>
+          <w:rFonts w:hint="eastAsia"/>
+        </w:rPr>
         <w:t xml:space="preserve">This BB Call product can </w:t>
       </w:r>
       <w:r>
@@ -974,13 +969,16 @@
         </w:rPr>
         <w:t>use the mobile phone to conversation.</w:t>
       </w:r>
+      <w:r>
+        <w:rPr>
+          <w:rFonts w:hint="eastAsia"/>
+        </w:rPr>
+        <w:t xml:space="preserve"> </w:t>
+      </w:r>
     </w:p>
     <w:p>
       <w:pPr>
         <w:outlineLvl w:val="1"/>
-        <w:rPr>
-          <w:rFonts w:hint="eastAsia"/>
-        </w:rPr>
       </w:pPr>
       <w:bookmarkStart w:id="8" w:name="_Toc225796343"/>
       <w:bookmarkStart w:id="9" w:name="_Toc225796524"/>
@@ -995,7 +993,7 @@
     </w:p>
     <w:tbl>
       <w:tblPr>
-        <w:tblStyle w:val="TableGrid"/>
+        <w:tblStyle w:val="af3"/>
         <w:tblW w:w="0" w:type="auto"/>
         <w:tblLook w:val="04A0" w:firstRow="1" w:lastRow="0" w:firstColumn="1" w:lastColumn="0" w:noHBand="0" w:noVBand="1"/>
       </w:tblPr>
@@ -1009,11 +1007,6 @@
             <w:tcW w:w="4675" w:type="dxa"/>
           </w:tcPr>
           <w:p>
-            <w:pPr>
-              <w:rPr>
-                <w:rFonts w:hint="eastAsia"/>
-              </w:rPr>
-            </w:pPr>
             <w:r>
               <w:rPr>
                 <w:rFonts w:hint="eastAsia"/>
@@ -1028,11 +1021,6 @@
             <w:tcW w:w="4675" w:type="dxa"/>
           </w:tcPr>
           <w:p>
-            <w:pPr>
-              <w:rPr>
-                <w:rFonts w:hint="eastAsia"/>
-              </w:rPr>
-            </w:pPr>
             <w:r>
               <w:rPr>
                 <w:rFonts w:hint="eastAsia"/>
@@ -1048,11 +1036,6 @@
             <w:tcW w:w="4675" w:type="dxa"/>
           </w:tcPr>
           <w:p>
-            <w:pPr>
-              <w:rPr>
-                <w:rFonts w:hint="eastAsia"/>
-              </w:rPr>
-            </w:pPr>
             <w:r>
               <w:rPr>
                 <w:rFonts w:hint="eastAsia"/>
@@ -1066,11 +1049,6 @@
             <w:tcW w:w="4675" w:type="dxa"/>
           </w:tcPr>
           <w:p>
-            <w:pPr>
-              <w:rPr>
-                <w:rFonts w:hint="eastAsia"/>
-              </w:rPr>
-            </w:pPr>
             <w:r>
               <w:rPr>
                 <w:rFonts w:hint="eastAsia"/>
@@ -1086,11 +1064,6 @@
             <w:tcW w:w="4675" w:type="dxa"/>
           </w:tcPr>
           <w:p>
-            <w:pPr>
-              <w:rPr>
-                <w:rFonts w:hint="eastAsia"/>
-              </w:rPr>
-            </w:pPr>
             <w:r>
               <w:rPr>
                 <w:rFonts w:hint="eastAsia"/>
@@ -1104,11 +1077,6 @@
             <w:tcW w:w="4675" w:type="dxa"/>
           </w:tcPr>
           <w:p>
-            <w:pPr>
-              <w:rPr>
-                <w:rFonts w:hint="eastAsia"/>
-              </w:rPr>
-            </w:pPr>
             <w:r>
               <w:rPr>
                 <w:rFonts w:hint="eastAsia"/>
@@ -1124,11 +1092,6 @@
             <w:tcW w:w="4675" w:type="dxa"/>
           </w:tcPr>
           <w:p>
-            <w:pPr>
-              <w:rPr>
-                <w:rFonts w:hint="eastAsia"/>
-              </w:rPr>
-            </w:pPr>
             <w:r>
               <w:rPr>
                 <w:rFonts w:hint="eastAsia"/>
@@ -1142,11 +1105,6 @@
             <w:tcW w:w="4675" w:type="dxa"/>
           </w:tcPr>
           <w:p>
-            <w:pPr>
-              <w:rPr>
-                <w:rFonts w:hint="eastAsia"/>
-              </w:rPr>
-            </w:pPr>
             <w:r>
               <w:rPr>
                 <w:rFonts w:hint="eastAsia"/>
@@ -1162,11 +1120,6 @@
             <w:tcW w:w="4675" w:type="dxa"/>
           </w:tcPr>
           <w:p>
-            <w:pPr>
-              <w:rPr>
-                <w:rFonts w:hint="eastAsia"/>
-              </w:rPr>
-            </w:pPr>
             <w:r>
               <w:rPr>
                 <w:rFonts w:hint="eastAsia"/>
@@ -1180,11 +1133,6 @@
             <w:tcW w:w="4675" w:type="dxa"/>
           </w:tcPr>
           <w:p>
-            <w:pPr>
-              <w:rPr>
-                <w:rFonts w:hint="eastAsia"/>
-              </w:rPr>
-            </w:pPr>
             <w:r>
               <w:rPr>
                 <w:rFonts w:hint="eastAsia"/>
@@ -1214,6 +1162,12 @@
           <w:rFonts w:hint="eastAsia"/>
         </w:rPr>
         <w:t>Arduino IDE, C#, and MQTT</w:t>
+      </w:r>
+      <w:r>
+        <w:rPr>
+          <w:rFonts w:hint="eastAsia"/>
+        </w:rPr>
+        <w:t>, Flutter Dart.</w:t>
       </w:r>
       <w:r>
         <w:br/>
@@ -1333,7 +1287,7 @@
 <w:ftr xmlns:wpc="http://schemas.microsoft.com/office/word/2010/wordprocessingCanvas" xmlns:cx="http://schemas.microsoft.com/office/drawing/2014/chartex" xmlns:cx1="http://schemas.microsoft.com/office/drawing/2015/9/8/chartex" xmlns:cx2="http://schemas.microsoft.com/office/drawing/2015/10/21/chartex" xmlns:cx3="http://schemas.microsoft.com/office/drawing/2016/5/9/chartex" xmlns:cx4="http://schemas.microsoft.com/office/drawing/2016/5/10/chartex" xmlns:cx5="http://schemas.microsoft.com/office/drawing/2016/5/11/chartex" xmlns:cx6="http://schemas.microsoft.com/office/drawing/2016/5/12/chartex" xmlns:cx7="http://schemas.microsoft.com/office/drawing/2016/5/13/chartex" xmlns:cx8="http://schemas.microsoft.com/office/drawing/2016/5/14/chartex" xmlns:mc="http://schemas.openxmlformats.org/markup-compatibility/2006" xmlns:aink="http://schemas.microsoft.com/office/drawing/2016/ink" xmlns:am3d="http://schemas.microsoft.com/office/drawing/2017/model3d" xmlns:o="urn:schemas-microsoft-com:office:office" xmlns:oel="http://schemas.microsoft.com/office/2019/extlst" xmlns:r="http://schemas.openxmlformats.org/officeDocument/2006/relationships" xmlns:m="http://schemas.openxmlformats.org/officeDocument/2006/math" xmlns:v="urn:schemas-microsoft-com:vml" xmlns:wp14="http://schemas.microsoft.com/office/word/2010/wordprocessingDrawing" xmlns:wp="http://schemas.openxmlformats.org/drawingml/2006/wordprocessingDrawing" xmlns:w10="urn:schemas-microsoft-com:office:word" xmlns:w="http://schemas.openxmlformats.org/wordprocessingml/2006/main" xmlns:w14="http://schemas.microsoft.com/office/word/2010/wordml" xmlns:w15="http://schemas.microsoft.com/office/word/2012/wordml" xmlns:w16cex="http://schemas.microsoft.com/office/word/2018/wordml/cex" xmlns:w16cid="http://schemas.microsoft.com/office/word/2016/wordml/cid" xmlns:w16="http://schemas.microsoft.com/office/word/2018/wordml" xmlns:w16du="http://schemas.microsoft.com/office/word/2023/wordml/word16du" xmlns:w16sdtdh="http://schemas.microsoft.com/office/word/2020/wordml/sdtdatahash" xmlns:w16sdtfl="http://schemas.microsoft.com/office/word/2024/wordml/sdtformatlock" xmlns:w16se="http://schemas.microsoft.com/office/word/2015/wordml/symex" xmlns:wpg="http://schemas.microsoft.com/office/word/2010/wordprocessingGroup" xmlns:wpi="http://schemas.microsoft.com/office/word/2010/wordprocessingInk" xmlns:wne="http://schemas.microsoft.com/office/word/2006/wordml" xmlns:wps="http://schemas.microsoft.com/office/word/2010/wordprocessingShape" mc:Ignorable="w14 w15 w16se w16cid w16 w16cex w16sdtdh w16sdtfl w16du wp14">
   <w:p>
     <w:pPr>
-      <w:pStyle w:val="Footer"/>
+      <w:pStyle w:val="af0"/>
       <w:jc w:val="center"/>
     </w:pPr>
     <w:r>
@@ -1862,15 +1816,15 @@
     <w:lsdException w:name="Unresolved Mention" w:semiHidden="1" w:unhideWhenUsed="1"/>
     <w:lsdException w:name="Smart Link" w:semiHidden="1" w:unhideWhenUsed="1"/>
   </w:latentStyles>
-  <w:style w:type="paragraph" w:default="1" w:styleId="Normal">
+  <w:style w:type="paragraph" w:default="1" w:styleId="a">
     <w:name w:val="Normal"/>
     <w:qFormat/>
   </w:style>
-  <w:style w:type="paragraph" w:styleId="Heading1">
+  <w:style w:type="paragraph" w:styleId="1">
     <w:name w:val="heading 1"/>
-    <w:basedOn w:val="Normal"/>
-    <w:next w:val="Normal"/>
-    <w:link w:val="Heading1Char"/>
+    <w:basedOn w:val="a"/>
+    <w:next w:val="a"/>
+    <w:link w:val="10"/>
     <w:uiPriority w:val="9"/>
     <w:qFormat/>
     <w:rsid w:val="004767C0"/>
@@ -1887,11 +1841,11 @@
       <w:szCs w:val="40"/>
     </w:rPr>
   </w:style>
-  <w:style w:type="paragraph" w:styleId="Heading2">
+  <w:style w:type="paragraph" w:styleId="2">
     <w:name w:val="heading 2"/>
-    <w:basedOn w:val="Normal"/>
-    <w:next w:val="Normal"/>
-    <w:link w:val="Heading2Char"/>
+    <w:basedOn w:val="a"/>
+    <w:next w:val="a"/>
+    <w:link w:val="20"/>
     <w:uiPriority w:val="9"/>
     <w:semiHidden/>
     <w:unhideWhenUsed/>
@@ -1910,11 +1864,11 @@
       <w:szCs w:val="32"/>
     </w:rPr>
   </w:style>
-  <w:style w:type="paragraph" w:styleId="Heading3">
+  <w:style w:type="paragraph" w:styleId="3">
     <w:name w:val="heading 3"/>
-    <w:basedOn w:val="Normal"/>
-    <w:next w:val="Normal"/>
-    <w:link w:val="Heading3Char"/>
+    <w:basedOn w:val="a"/>
+    <w:next w:val="a"/>
+    <w:link w:val="30"/>
     <w:uiPriority w:val="9"/>
     <w:semiHidden/>
     <w:unhideWhenUsed/>
@@ -1933,11 +1887,11 @@
       <w:szCs w:val="28"/>
     </w:rPr>
   </w:style>
-  <w:style w:type="paragraph" w:styleId="Heading4">
+  <w:style w:type="paragraph" w:styleId="4">
     <w:name w:val="heading 4"/>
-    <w:basedOn w:val="Normal"/>
-    <w:next w:val="Normal"/>
-    <w:link w:val="Heading4Char"/>
+    <w:basedOn w:val="a"/>
+    <w:next w:val="a"/>
+    <w:link w:val="40"/>
     <w:uiPriority w:val="9"/>
     <w:semiHidden/>
     <w:unhideWhenUsed/>
@@ -1956,11 +1910,11 @@
       <w:color w:val="0F4761" w:themeColor="accent1" w:themeShade="BF"/>
     </w:rPr>
   </w:style>
-  <w:style w:type="paragraph" w:styleId="Heading5">
+  <w:style w:type="paragraph" w:styleId="5">
     <w:name w:val="heading 5"/>
-    <w:basedOn w:val="Normal"/>
-    <w:next w:val="Normal"/>
-    <w:link w:val="Heading5Char"/>
+    <w:basedOn w:val="a"/>
+    <w:next w:val="a"/>
+    <w:link w:val="50"/>
     <w:uiPriority w:val="9"/>
     <w:semiHidden/>
     <w:unhideWhenUsed/>
@@ -1977,11 +1931,11 @@
       <w:color w:val="0F4761" w:themeColor="accent1" w:themeShade="BF"/>
     </w:rPr>
   </w:style>
-  <w:style w:type="paragraph" w:styleId="Heading6">
+  <w:style w:type="paragraph" w:styleId="6">
     <w:name w:val="heading 6"/>
-    <w:basedOn w:val="Normal"/>
-    <w:next w:val="Normal"/>
-    <w:link w:val="Heading6Char"/>
+    <w:basedOn w:val="a"/>
+    <w:next w:val="a"/>
+    <w:link w:val="60"/>
     <w:uiPriority w:val="9"/>
     <w:semiHidden/>
     <w:unhideWhenUsed/>
@@ -2000,11 +1954,11 @@
       <w:color w:val="595959" w:themeColor="text1" w:themeTint="A6"/>
     </w:rPr>
   </w:style>
-  <w:style w:type="paragraph" w:styleId="Heading7">
+  <w:style w:type="paragraph" w:styleId="7">
     <w:name w:val="heading 7"/>
-    <w:basedOn w:val="Normal"/>
-    <w:next w:val="Normal"/>
-    <w:link w:val="Heading7Char"/>
+    <w:basedOn w:val="a"/>
+    <w:next w:val="a"/>
+    <w:link w:val="70"/>
     <w:uiPriority w:val="9"/>
     <w:semiHidden/>
     <w:unhideWhenUsed/>
@@ -2021,11 +1975,11 @@
       <w:color w:val="595959" w:themeColor="text1" w:themeTint="A6"/>
     </w:rPr>
   </w:style>
-  <w:style w:type="paragraph" w:styleId="Heading8">
+  <w:style w:type="paragraph" w:styleId="8">
     <w:name w:val="heading 8"/>
-    <w:basedOn w:val="Normal"/>
-    <w:next w:val="Normal"/>
-    <w:link w:val="Heading8Char"/>
+    <w:basedOn w:val="a"/>
+    <w:next w:val="a"/>
+    <w:link w:val="80"/>
     <w:uiPriority w:val="9"/>
     <w:semiHidden/>
     <w:unhideWhenUsed/>
@@ -2044,11 +1998,11 @@
       <w:color w:val="272727" w:themeColor="text1" w:themeTint="D8"/>
     </w:rPr>
   </w:style>
-  <w:style w:type="paragraph" w:styleId="Heading9">
+  <w:style w:type="paragraph" w:styleId="9">
     <w:name w:val="heading 9"/>
-    <w:basedOn w:val="Normal"/>
-    <w:next w:val="Normal"/>
-    <w:link w:val="Heading9Char"/>
+    <w:basedOn w:val="a"/>
+    <w:next w:val="a"/>
+    <w:link w:val="90"/>
     <w:uiPriority w:val="9"/>
     <w:semiHidden/>
     <w:unhideWhenUsed/>
@@ -2065,13 +2019,13 @@
       <w:color w:val="272727" w:themeColor="text1" w:themeTint="D8"/>
     </w:rPr>
   </w:style>
-  <w:style w:type="character" w:default="1" w:styleId="DefaultParagraphFont">
+  <w:style w:type="character" w:default="1" w:styleId="a0">
     <w:name w:val="Default Paragraph Font"/>
     <w:uiPriority w:val="1"/>
     <w:semiHidden/>
     <w:unhideWhenUsed/>
   </w:style>
-  <w:style w:type="table" w:default="1" w:styleId="TableNormal">
+  <w:style w:type="table" w:default="1" w:styleId="a1">
     <w:name w:val="Normal Table"/>
     <w:uiPriority w:val="99"/>
     <w:semiHidden/>
@@ -2086,16 +2040,16 @@
       </w:tblCellMar>
     </w:tblPr>
   </w:style>
-  <w:style w:type="numbering" w:default="1" w:styleId="NoList">
+  <w:style w:type="numbering" w:default="1" w:styleId="a2">
     <w:name w:val="No List"/>
     <w:uiPriority w:val="99"/>
     <w:semiHidden/>
     <w:unhideWhenUsed/>
   </w:style>
-  <w:style w:type="character" w:customStyle="1" w:styleId="Heading1Char">
-    <w:name w:val="Heading 1 Char"/>
-    <w:basedOn w:val="DefaultParagraphFont"/>
-    <w:link w:val="Heading1"/>
+  <w:style w:type="character" w:customStyle="1" w:styleId="10">
+    <w:name w:val="標題 1 字元"/>
+    <w:basedOn w:val="a0"/>
+    <w:link w:val="1"/>
     <w:uiPriority w:val="9"/>
     <w:rsid w:val="004767C0"/>
     <w:rPr>
@@ -2105,10 +2059,10 @@
       <w:szCs w:val="40"/>
     </w:rPr>
   </w:style>
-  <w:style w:type="character" w:customStyle="1" w:styleId="Heading2Char">
-    <w:name w:val="Heading 2 Char"/>
-    <w:basedOn w:val="DefaultParagraphFont"/>
-    <w:link w:val="Heading2"/>
+  <w:style w:type="character" w:customStyle="1" w:styleId="20">
+    <w:name w:val="標題 2 字元"/>
+    <w:basedOn w:val="a0"/>
+    <w:link w:val="2"/>
     <w:uiPriority w:val="9"/>
     <w:semiHidden/>
     <w:rsid w:val="004767C0"/>
@@ -2119,10 +2073,10 @@
       <w:szCs w:val="32"/>
     </w:rPr>
   </w:style>
-  <w:style w:type="character" w:customStyle="1" w:styleId="Heading3Char">
-    <w:name w:val="Heading 3 Char"/>
-    <w:basedOn w:val="DefaultParagraphFont"/>
-    <w:link w:val="Heading3"/>
+  <w:style w:type="character" w:customStyle="1" w:styleId="30">
+    <w:name w:val="標題 3 字元"/>
+    <w:basedOn w:val="a0"/>
+    <w:link w:val="3"/>
     <w:uiPriority w:val="9"/>
     <w:semiHidden/>
     <w:rsid w:val="004767C0"/>
@@ -2133,10 +2087,10 @@
       <w:szCs w:val="28"/>
     </w:rPr>
   </w:style>
-  <w:style w:type="character" w:customStyle="1" w:styleId="Heading4Char">
-    <w:name w:val="Heading 4 Char"/>
-    <w:basedOn w:val="DefaultParagraphFont"/>
-    <w:link w:val="Heading4"/>
+  <w:style w:type="character" w:customStyle="1" w:styleId="40">
+    <w:name w:val="標題 4 字元"/>
+    <w:basedOn w:val="a0"/>
+    <w:link w:val="4"/>
     <w:uiPriority w:val="9"/>
     <w:semiHidden/>
     <w:rsid w:val="004767C0"/>
@@ -2147,10 +2101,10 @@
       <w:color w:val="0F4761" w:themeColor="accent1" w:themeShade="BF"/>
     </w:rPr>
   </w:style>
-  <w:style w:type="character" w:customStyle="1" w:styleId="Heading5Char">
-    <w:name w:val="Heading 5 Char"/>
-    <w:basedOn w:val="DefaultParagraphFont"/>
-    <w:link w:val="Heading5"/>
+  <w:style w:type="character" w:customStyle="1" w:styleId="50">
+    <w:name w:val="標題 5 字元"/>
+    <w:basedOn w:val="a0"/>
+    <w:link w:val="5"/>
     <w:uiPriority w:val="9"/>
     <w:semiHidden/>
     <w:rsid w:val="004767C0"/>
@@ -2159,10 +2113,10 @@
       <w:color w:val="0F4761" w:themeColor="accent1" w:themeShade="BF"/>
     </w:rPr>
   </w:style>
-  <w:style w:type="character" w:customStyle="1" w:styleId="Heading6Char">
-    <w:name w:val="Heading 6 Char"/>
-    <w:basedOn w:val="DefaultParagraphFont"/>
-    <w:link w:val="Heading6"/>
+  <w:style w:type="character" w:customStyle="1" w:styleId="60">
+    <w:name w:val="標題 6 字元"/>
+    <w:basedOn w:val="a0"/>
+    <w:link w:val="6"/>
     <w:uiPriority w:val="9"/>
     <w:semiHidden/>
     <w:rsid w:val="004767C0"/>
@@ -2173,10 +2127,10 @@
       <w:color w:val="595959" w:themeColor="text1" w:themeTint="A6"/>
     </w:rPr>
   </w:style>
-  <w:style w:type="character" w:customStyle="1" w:styleId="Heading7Char">
-    <w:name w:val="Heading 7 Char"/>
-    <w:basedOn w:val="DefaultParagraphFont"/>
-    <w:link w:val="Heading7"/>
+  <w:style w:type="character" w:customStyle="1" w:styleId="70">
+    <w:name w:val="標題 7 字元"/>
+    <w:basedOn w:val="a0"/>
+    <w:link w:val="7"/>
     <w:uiPriority w:val="9"/>
     <w:semiHidden/>
     <w:rsid w:val="004767C0"/>
@@ -2185,10 +2139,10 @@
       <w:color w:val="595959" w:themeColor="text1" w:themeTint="A6"/>
     </w:rPr>
   </w:style>
-  <w:style w:type="character" w:customStyle="1" w:styleId="Heading8Char">
-    <w:name w:val="Heading 8 Char"/>
-    <w:basedOn w:val="DefaultParagraphFont"/>
-    <w:link w:val="Heading8"/>
+  <w:style w:type="character" w:customStyle="1" w:styleId="80">
+    <w:name w:val="標題 8 字元"/>
+    <w:basedOn w:val="a0"/>
+    <w:link w:val="8"/>
     <w:uiPriority w:val="9"/>
     <w:semiHidden/>
     <w:rsid w:val="004767C0"/>
@@ -2199,10 +2153,10 @@
       <w:color w:val="272727" w:themeColor="text1" w:themeTint="D8"/>
     </w:rPr>
   </w:style>
-  <w:style w:type="character" w:customStyle="1" w:styleId="Heading9Char">
-    <w:name w:val="Heading 9 Char"/>
-    <w:basedOn w:val="DefaultParagraphFont"/>
-    <w:link w:val="Heading9"/>
+  <w:style w:type="character" w:customStyle="1" w:styleId="90">
+    <w:name w:val="標題 9 字元"/>
+    <w:basedOn w:val="a0"/>
+    <w:link w:val="9"/>
     <w:uiPriority w:val="9"/>
     <w:semiHidden/>
     <w:rsid w:val="004767C0"/>
@@ -2211,11 +2165,11 @@
       <w:color w:val="272727" w:themeColor="text1" w:themeTint="D8"/>
     </w:rPr>
   </w:style>
-  <w:style w:type="paragraph" w:styleId="Title">
+  <w:style w:type="paragraph" w:styleId="a3">
     <w:name w:val="Title"/>
-    <w:basedOn w:val="Normal"/>
-    <w:next w:val="Normal"/>
-    <w:link w:val="TitleChar"/>
+    <w:basedOn w:val="a"/>
+    <w:next w:val="a"/>
+    <w:link w:val="a4"/>
     <w:uiPriority w:val="10"/>
     <w:qFormat/>
     <w:rsid w:val="004767C0"/>
@@ -2231,10 +2185,10 @@
       <w:szCs w:val="56"/>
     </w:rPr>
   </w:style>
-  <w:style w:type="character" w:customStyle="1" w:styleId="TitleChar">
-    <w:name w:val="Title Char"/>
-    <w:basedOn w:val="DefaultParagraphFont"/>
-    <w:link w:val="Title"/>
+  <w:style w:type="character" w:customStyle="1" w:styleId="a4">
+    <w:name w:val="標題 字元"/>
+    <w:basedOn w:val="a0"/>
+    <w:link w:val="a3"/>
     <w:uiPriority w:val="10"/>
     <w:rsid w:val="004767C0"/>
     <w:rPr>
@@ -2245,11 +2199,11 @@
       <w:szCs w:val="56"/>
     </w:rPr>
   </w:style>
-  <w:style w:type="paragraph" w:styleId="Subtitle">
+  <w:style w:type="paragraph" w:styleId="a5">
     <w:name w:val="Subtitle"/>
-    <w:basedOn w:val="Normal"/>
-    <w:next w:val="Normal"/>
-    <w:link w:val="SubtitleChar"/>
+    <w:basedOn w:val="a"/>
+    <w:next w:val="a"/>
+    <w:link w:val="a6"/>
     <w:uiPriority w:val="11"/>
     <w:qFormat/>
     <w:rsid w:val="004767C0"/>
@@ -2266,10 +2220,10 @@
       <w:szCs w:val="28"/>
     </w:rPr>
   </w:style>
-  <w:style w:type="character" w:customStyle="1" w:styleId="SubtitleChar">
-    <w:name w:val="Subtitle Char"/>
-    <w:basedOn w:val="DefaultParagraphFont"/>
-    <w:link w:val="Subtitle"/>
+  <w:style w:type="character" w:customStyle="1" w:styleId="a6">
+    <w:name w:val="副標題 字元"/>
+    <w:basedOn w:val="a0"/>
+    <w:link w:val="a5"/>
     <w:uiPriority w:val="11"/>
     <w:rsid w:val="004767C0"/>
     <w:rPr>
@@ -2280,11 +2234,11 @@
       <w:szCs w:val="28"/>
     </w:rPr>
   </w:style>
-  <w:style w:type="paragraph" w:styleId="Quote">
+  <w:style w:type="paragraph" w:styleId="a7">
     <w:name w:val="Quote"/>
-    <w:basedOn w:val="Normal"/>
-    <w:next w:val="Normal"/>
-    <w:link w:val="QuoteChar"/>
+    <w:basedOn w:val="a"/>
+    <w:next w:val="a"/>
+    <w:link w:val="a8"/>
     <w:uiPriority w:val="29"/>
     <w:qFormat/>
     <w:rsid w:val="004767C0"/>
@@ -2298,10 +2252,10 @@
       <w:color w:val="404040" w:themeColor="text1" w:themeTint="BF"/>
     </w:rPr>
   </w:style>
-  <w:style w:type="character" w:customStyle="1" w:styleId="QuoteChar">
-    <w:name w:val="Quote Char"/>
-    <w:basedOn w:val="DefaultParagraphFont"/>
-    <w:link w:val="Quote"/>
+  <w:style w:type="character" w:customStyle="1" w:styleId="a8">
+    <w:name w:val="引文 字元"/>
+    <w:basedOn w:val="a0"/>
+    <w:link w:val="a7"/>
     <w:uiPriority w:val="29"/>
     <w:rsid w:val="004767C0"/>
     <w:rPr>
@@ -2310,9 +2264,9 @@
       <w:color w:val="404040" w:themeColor="text1" w:themeTint="BF"/>
     </w:rPr>
   </w:style>
-  <w:style w:type="paragraph" w:styleId="ListParagraph">
+  <w:style w:type="paragraph" w:styleId="a9">
     <w:name w:val="List Paragraph"/>
-    <w:basedOn w:val="Normal"/>
+    <w:basedOn w:val="a"/>
     <w:uiPriority w:val="34"/>
     <w:qFormat/>
     <w:rsid w:val="004767C0"/>
@@ -2321,9 +2275,9 @@
       <w:contextualSpacing/>
     </w:pPr>
   </w:style>
-  <w:style w:type="character" w:styleId="IntenseEmphasis">
+  <w:style w:type="character" w:styleId="aa">
     <w:name w:val="Intense Emphasis"/>
-    <w:basedOn w:val="DefaultParagraphFont"/>
+    <w:basedOn w:val="a0"/>
     <w:uiPriority w:val="21"/>
     <w:qFormat/>
     <w:rsid w:val="004767C0"/>
@@ -2333,11 +2287,11 @@
       <w:color w:val="0F4761" w:themeColor="accent1" w:themeShade="BF"/>
     </w:rPr>
   </w:style>
-  <w:style w:type="paragraph" w:styleId="IntenseQuote">
+  <w:style w:type="paragraph" w:styleId="ab">
     <w:name w:val="Intense Quote"/>
-    <w:basedOn w:val="Normal"/>
-    <w:next w:val="Normal"/>
-    <w:link w:val="IntenseQuoteChar"/>
+    <w:basedOn w:val="a"/>
+    <w:next w:val="a"/>
+    <w:link w:val="ac"/>
     <w:uiPriority w:val="30"/>
     <w:qFormat/>
     <w:rsid w:val="004767C0"/>
@@ -2356,10 +2310,10 @@
       <w:color w:val="0F4761" w:themeColor="accent1" w:themeShade="BF"/>
     </w:rPr>
   </w:style>
-  <w:style w:type="character" w:customStyle="1" w:styleId="IntenseQuoteChar">
-    <w:name w:val="Intense Quote Char"/>
-    <w:basedOn w:val="DefaultParagraphFont"/>
-    <w:link w:val="IntenseQuote"/>
+  <w:style w:type="character" w:customStyle="1" w:styleId="ac">
+    <w:name w:val="鮮明引文 字元"/>
+    <w:basedOn w:val="a0"/>
+    <w:link w:val="ab"/>
     <w:uiPriority w:val="30"/>
     <w:rsid w:val="004767C0"/>
     <w:rPr>
@@ -2368,9 +2322,9 @@
       <w:color w:val="0F4761" w:themeColor="accent1" w:themeShade="BF"/>
     </w:rPr>
   </w:style>
-  <w:style w:type="character" w:styleId="IntenseReference">
+  <w:style w:type="character" w:styleId="ad">
     <w:name w:val="Intense Reference"/>
-    <w:basedOn w:val="DefaultParagraphFont"/>
+    <w:basedOn w:val="a0"/>
     <w:uiPriority w:val="32"/>
     <w:qFormat/>
     <w:rsid w:val="004767C0"/>
@@ -2382,10 +2336,10 @@
       <w:spacing w:val="5"/>
     </w:rPr>
   </w:style>
-  <w:style w:type="paragraph" w:styleId="Header">
+  <w:style w:type="paragraph" w:styleId="ae">
     <w:name w:val="header"/>
-    <w:basedOn w:val="Normal"/>
-    <w:link w:val="HeaderChar"/>
+    <w:basedOn w:val="a"/>
+    <w:link w:val="af"/>
     <w:uiPriority w:val="99"/>
     <w:unhideWhenUsed/>
     <w:rsid w:val="00B17058"/>
@@ -2397,17 +2351,17 @@
       <w:spacing w:after="0" w:line="240" w:lineRule="auto"/>
     </w:pPr>
   </w:style>
-  <w:style w:type="character" w:customStyle="1" w:styleId="HeaderChar">
-    <w:name w:val="Header Char"/>
-    <w:basedOn w:val="DefaultParagraphFont"/>
-    <w:link w:val="Header"/>
+  <w:style w:type="character" w:customStyle="1" w:styleId="af">
+    <w:name w:val="頁首 字元"/>
+    <w:basedOn w:val="a0"/>
+    <w:link w:val="ae"/>
     <w:uiPriority w:val="99"/>
     <w:rsid w:val="00B17058"/>
   </w:style>
-  <w:style w:type="paragraph" w:styleId="Footer">
+  <w:style w:type="paragraph" w:styleId="af0">
     <w:name w:val="footer"/>
-    <w:basedOn w:val="Normal"/>
-    <w:link w:val="FooterChar"/>
+    <w:basedOn w:val="a"/>
+    <w:link w:val="af1"/>
     <w:uiPriority w:val="99"/>
     <w:unhideWhenUsed/>
     <w:rsid w:val="00B17058"/>
@@ -2419,17 +2373,17 @@
       <w:spacing w:after="0" w:line="240" w:lineRule="auto"/>
     </w:pPr>
   </w:style>
-  <w:style w:type="character" w:customStyle="1" w:styleId="FooterChar">
-    <w:name w:val="Footer Char"/>
-    <w:basedOn w:val="DefaultParagraphFont"/>
-    <w:link w:val="Footer"/>
+  <w:style w:type="character" w:customStyle="1" w:styleId="af1">
+    <w:name w:val="頁尾 字元"/>
+    <w:basedOn w:val="a0"/>
+    <w:link w:val="af0"/>
     <w:uiPriority w:val="99"/>
     <w:rsid w:val="00B17058"/>
   </w:style>
-  <w:style w:type="paragraph" w:styleId="TOC1">
+  <w:style w:type="paragraph" w:styleId="11">
     <w:name w:val="toc 1"/>
-    <w:basedOn w:val="Normal"/>
-    <w:next w:val="Normal"/>
+    <w:basedOn w:val="a"/>
+    <w:next w:val="a"/>
     <w:autoRedefine/>
     <w:uiPriority w:val="39"/>
     <w:unhideWhenUsed/>
@@ -2438,10 +2392,10 @@
       <w:spacing w:after="100"/>
     </w:pPr>
   </w:style>
-  <w:style w:type="paragraph" w:styleId="TOC2">
+  <w:style w:type="paragraph" w:styleId="21">
     <w:name w:val="toc 2"/>
-    <w:basedOn w:val="Normal"/>
-    <w:next w:val="Normal"/>
+    <w:basedOn w:val="a"/>
+    <w:next w:val="a"/>
     <w:autoRedefine/>
     <w:uiPriority w:val="39"/>
     <w:unhideWhenUsed/>
@@ -2451,9 +2405,9 @@
       <w:ind w:left="240"/>
     </w:pPr>
   </w:style>
-  <w:style w:type="character" w:styleId="Hyperlink">
+  <w:style w:type="character" w:styleId="af2">
     <w:name w:val="Hyperlink"/>
-    <w:basedOn w:val="DefaultParagraphFont"/>
+    <w:basedOn w:val="a0"/>
     <w:uiPriority w:val="99"/>
     <w:unhideWhenUsed/>
     <w:rsid w:val="006A3562"/>
@@ -2462,9 +2416,9 @@
       <w:u w:val="single"/>
     </w:rPr>
   </w:style>
-  <w:style w:type="table" w:styleId="TableGrid">
+  <w:style w:type="table" w:styleId="af3">
     <w:name w:val="Table Grid"/>
-    <w:basedOn w:val="TableNormal"/>
+    <w:basedOn w:val="a1"/>
     <w:uiPriority w:val="39"/>
     <w:rsid w:val="00053CC1"/>
     <w:pPr>

</xml_diff>